<commit_message>
docs: record GitHub and Feishu collaboration links
</commit_message>
<xml_diff>
--- a/docs/20_Demo_2.0当前完成情况与后续执行计划.docx
+++ b/docs/20_Demo_2.0当前完成情况与后续执行计划.docx
@@ -124,7 +124,7 @@
           <w:color w:val="263B38"/>
           <w:sz w:val="21"/>
         </w:rPr>
-        <w:t>：截至 2026 年 9 月 16 日的已完成工作、验证证据、未完成事项和后续执行步骤</w:t>
+        <w:t>：截至 2026 年 9 月 17 日的已完成工作、验证证据、未完成事项和后续执行步骤</w:t>
       </w:r>
     </w:p>
     <w:p>
@@ -230,6 +230,657 @@
         </w:rPr>
         <w:t xml:space="preserve"> 维护分支完整保留。</w:t>
       </w:r>
+    </w:p>
+    <w:p>
+      <w:r>
+        <w:rPr>
+          <w:rFonts w:ascii="Microsoft YaHei" w:hAnsi="Microsoft YaHei" w:eastAsia="Microsoft YaHei"/>
+          <w:color w:val="263B38"/>
+          <w:sz w:val="21"/>
+        </w:rPr>
+        <w:t>GitHub 与飞书协作基础设施已经落地。</w:t>
+      </w:r>
+      <w:r>
+        <w:rPr>
+          <w:rFonts w:ascii="Consolas" w:hAnsi="Consolas" w:eastAsia="Consolas"/>
+          <w:color w:val="0B6F65"/>
+          <w:sz w:val="19"/>
+        </w:rPr>
+        <w:t>main</w:t>
+      </w:r>
+      <w:r>
+        <w:rPr>
+          <w:rFonts w:ascii="Microsoft YaHei" w:hAnsi="Microsoft YaHei" w:eastAsia="Microsoft YaHei"/>
+          <w:color w:val="263B38"/>
+          <w:sz w:val="21"/>
+        </w:rPr>
+        <w:t>、</w:t>
+      </w:r>
+      <w:r>
+        <w:rPr>
+          <w:rFonts w:ascii="Consolas" w:hAnsi="Consolas" w:eastAsia="Consolas"/>
+          <w:color w:val="0B6F65"/>
+          <w:sz w:val="19"/>
+        </w:rPr>
+        <w:t>release/1.x</w:t>
+      </w:r>
+      <w:r>
+        <w:rPr>
+          <w:rFonts w:ascii="Microsoft YaHei" w:hAnsi="Microsoft YaHei" w:eastAsia="Microsoft YaHei"/>
+          <w:color w:val="263B38"/>
+          <w:sz w:val="21"/>
+        </w:rPr>
+        <w:t>、</w:t>
+      </w:r>
+      <w:r>
+        <w:rPr>
+          <w:rFonts w:ascii="Consolas" w:hAnsi="Consolas" w:eastAsia="Consolas"/>
+          <w:color w:val="0B6F65"/>
+          <w:sz w:val="19"/>
+        </w:rPr>
+        <w:t>codex/v2-rebuild</w:t>
+      </w:r>
+      <w:r>
+        <w:rPr>
+          <w:rFonts w:ascii="Microsoft YaHei" w:hAnsi="Microsoft YaHei" w:eastAsia="Microsoft YaHei"/>
+          <w:color w:val="263B38"/>
+          <w:sz w:val="21"/>
+        </w:rPr>
+        <w:t xml:space="preserve"> 和 </w:t>
+      </w:r>
+      <w:r>
+        <w:rPr>
+          <w:rFonts w:ascii="Consolas" w:hAnsi="Consolas" w:eastAsia="Consolas"/>
+          <w:color w:val="0B6F65"/>
+          <w:sz w:val="19"/>
+        </w:rPr>
+        <w:t>v1.0.0</w:t>
+      </w:r>
+      <w:r>
+        <w:rPr>
+          <w:rFonts w:ascii="Microsoft YaHei" w:hAnsi="Microsoft YaHei" w:eastAsia="Microsoft YaHei"/>
+          <w:color w:val="263B38"/>
+          <w:sz w:val="21"/>
+        </w:rPr>
+        <w:t xml:space="preserve"> 均已推送到远端；2.0 已建立[草稿合并请求 #1](https://github.com/yingh2180-dotcom/consumer-signal-radar/pull/1)，尚未合并，因此 1.0 仍是当前正式主线。飞书已建立固定项目目录、聊天归档和“引用文档与附件”目录，后续项目讨论文档统一放入该位置。</w:t>
+      </w:r>
+    </w:p>
+    <w:p>
+      <w:pPr>
+        <w:pStyle w:val="Heading2"/>
+      </w:pPr>
+      <w:r>
+        <w:rPr>
+          <w:rFonts w:ascii="Microsoft YaHei" w:hAnsi="Microsoft YaHei" w:eastAsia="Microsoft YaHei"/>
+          <w:color w:val="000000"/>
+          <w:sz w:val="25"/>
+        </w:rPr>
+        <w:t>1.1 已落地的协作入口</w:t>
+      </w:r>
+    </w:p>
+    <w:tbl>
+      <w:tblPr>
+        <w:tblW w:type="auto" w:w="0"/>
+        <w:jc w:val="center"/>
+        <w:tblLayout w:type="fixed"/>
+        <w:tblLook w:firstColumn="1" w:firstRow="1" w:lastColumn="0" w:lastRow="0" w:noHBand="0" w:noVBand="1" w:val="04A0"/>
+      </w:tblPr>
+      <w:tblGrid>
+        <w:gridCol w:w="3118"/>
+        <w:gridCol w:w="3118"/>
+        <w:gridCol w:w="3118"/>
+      </w:tblGrid>
+      <w:tr>
+        <w:trPr>
+          <w:tblHeader w:val="true"/>
+        </w:trPr>
+        <w:tc>
+          <w:tcPr>
+            <w:tcW w:type="dxa" w:w="1620"/>
+            <w:vAlign w:val="center"/>
+            <w:shd w:fill="0B6F65"/>
+            <w:tcBorders>
+              <w:top w:val="single" w:sz="5" w:color="D9E2E0"/>
+              <w:left w:val="single" w:sz="5" w:color="D9E2E0"/>
+              <w:bottom w:val="single" w:sz="5" w:color="D9E2E0"/>
+              <w:right w:val="single" w:sz="5" w:color="D9E2E0"/>
+              <w:insideH w:val="single" w:sz="5" w:color="D9E2E0"/>
+              <w:insideV w:val="single" w:sz="5" w:color="D9E2E0"/>
+            </w:tcBorders>
+            <w:tcMar>
+              <w:top w:w="100" w:type="dxa"/>
+              <w:start w:w="120" w:type="dxa"/>
+              <w:bottom w:w="100" w:type="dxa"/>
+              <w:end w:w="120" w:type="dxa"/>
+            </w:tcMar>
+          </w:tcPr>
+          <w:p>
+            <w:pPr>
+              <w:jc w:val="center"/>
+            </w:pPr>
+            <w:r>
+              <w:rPr>
+                <w:rFonts w:ascii="Microsoft YaHei" w:hAnsi="Microsoft YaHei" w:eastAsia="Microsoft YaHei"/>
+                <w:b/>
+                <w:color w:val="FFFFFF"/>
+                <w:sz w:val="18"/>
+              </w:rPr>
+              <w:t>对象</w:t>
+            </w:r>
+          </w:p>
+        </w:tc>
+        <w:tc>
+          <w:tcPr>
+            <w:tcW w:type="dxa" w:w="4680"/>
+            <w:vAlign w:val="center"/>
+            <w:shd w:fill="0B6F65"/>
+            <w:tcBorders>
+              <w:top w:val="single" w:sz="5" w:color="D9E2E0"/>
+              <w:left w:val="single" w:sz="5" w:color="D9E2E0"/>
+              <w:bottom w:val="single" w:sz="5" w:color="D9E2E0"/>
+              <w:right w:val="single" w:sz="5" w:color="D9E2E0"/>
+              <w:insideH w:val="single" w:sz="5" w:color="D9E2E0"/>
+              <w:insideV w:val="single" w:sz="5" w:color="D9E2E0"/>
+            </w:tcBorders>
+            <w:tcMar>
+              <w:top w:w="100" w:type="dxa"/>
+              <w:start w:w="120" w:type="dxa"/>
+              <w:bottom w:w="100" w:type="dxa"/>
+              <w:end w:w="120" w:type="dxa"/>
+            </w:tcMar>
+          </w:tcPr>
+          <w:p>
+            <w:pPr>
+              <w:jc w:val="center"/>
+            </w:pPr>
+            <w:r>
+              <w:rPr>
+                <w:rFonts w:ascii="Microsoft YaHei" w:hAnsi="Microsoft YaHei" w:eastAsia="Microsoft YaHei"/>
+                <w:b/>
+                <w:color w:val="FFFFFF"/>
+                <w:sz w:val="18"/>
+              </w:rPr>
+              <w:t>当前状态</w:t>
+            </w:r>
+          </w:p>
+        </w:tc>
+        <w:tc>
+          <w:tcPr>
+            <w:tcW w:type="dxa" w:w="2700"/>
+            <w:vAlign w:val="center"/>
+            <w:shd w:fill="0B6F65"/>
+            <w:tcBorders>
+              <w:top w:val="single" w:sz="5" w:color="D9E2E0"/>
+              <w:left w:val="single" w:sz="5" w:color="D9E2E0"/>
+              <w:bottom w:val="single" w:sz="5" w:color="D9E2E0"/>
+              <w:right w:val="single" w:sz="5" w:color="D9E2E0"/>
+              <w:insideH w:val="single" w:sz="5" w:color="D9E2E0"/>
+              <w:insideV w:val="single" w:sz="5" w:color="D9E2E0"/>
+            </w:tcBorders>
+            <w:tcMar>
+              <w:top w:w="100" w:type="dxa"/>
+              <w:start w:w="120" w:type="dxa"/>
+              <w:bottom w:w="100" w:type="dxa"/>
+              <w:end w:w="120" w:type="dxa"/>
+            </w:tcMar>
+          </w:tcPr>
+          <w:p>
+            <w:pPr>
+              <w:jc w:val="center"/>
+            </w:pPr>
+            <w:r>
+              <w:rPr>
+                <w:rFonts w:ascii="Microsoft YaHei" w:hAnsi="Microsoft YaHei" w:eastAsia="Microsoft YaHei"/>
+                <w:b/>
+                <w:color w:val="FFFFFF"/>
+                <w:sz w:val="18"/>
+              </w:rPr>
+              <w:t>可审核链接</w:t>
+            </w:r>
+          </w:p>
+        </w:tc>
+      </w:tr>
+      <w:tr>
+        <w:tc>
+          <w:tcPr>
+            <w:tcW w:type="dxa" w:w="1620"/>
+            <w:vAlign w:val="center"/>
+            <w:shd w:fill="FFFFFF"/>
+            <w:tcBorders>
+              <w:top w:val="single" w:sz="5" w:color="D9E2E0"/>
+              <w:left w:val="single" w:sz="5" w:color="D9E2E0"/>
+              <w:bottom w:val="single" w:sz="5" w:color="D9E2E0"/>
+              <w:right w:val="single" w:sz="5" w:color="D9E2E0"/>
+              <w:insideH w:val="single" w:sz="5" w:color="D9E2E0"/>
+              <w:insideV w:val="single" w:sz="5" w:color="D9E2E0"/>
+            </w:tcBorders>
+            <w:tcMar>
+              <w:top w:w="100" w:type="dxa"/>
+              <w:start w:w="120" w:type="dxa"/>
+              <w:bottom w:w="100" w:type="dxa"/>
+              <w:end w:w="120" w:type="dxa"/>
+            </w:tcMar>
+          </w:tcPr>
+          <w:p>
+            <w:pPr>
+              <w:spacing w:after="0" w:line="276" w:lineRule="auto"/>
+              <w:jc w:val="center"/>
+            </w:pPr>
+            <w:r>
+              <w:rPr>
+                <w:rFonts w:ascii="Microsoft YaHei" w:hAnsi="Microsoft YaHei" w:eastAsia="Microsoft YaHei"/>
+                <w:color w:val="263B38"/>
+                <w:sz w:val="17"/>
+              </w:rPr>
+              <w:t>GitHub 2.0</w:t>
+            </w:r>
+          </w:p>
+        </w:tc>
+        <w:tc>
+          <w:tcPr>
+            <w:tcW w:type="dxa" w:w="4680"/>
+            <w:vAlign w:val="center"/>
+            <w:shd w:fill="FFFFFF"/>
+            <w:tcBorders>
+              <w:top w:val="single" w:sz="5" w:color="D9E2E0"/>
+              <w:left w:val="single" w:sz="5" w:color="D9E2E0"/>
+              <w:bottom w:val="single" w:sz="5" w:color="D9E2E0"/>
+              <w:right w:val="single" w:sz="5" w:color="D9E2E0"/>
+              <w:insideH w:val="single" w:sz="5" w:color="D9E2E0"/>
+              <w:insideV w:val="single" w:sz="5" w:color="D9E2E0"/>
+            </w:tcBorders>
+            <w:tcMar>
+              <w:top w:w="100" w:type="dxa"/>
+              <w:start w:w="120" w:type="dxa"/>
+              <w:bottom w:w="100" w:type="dxa"/>
+              <w:end w:w="120" w:type="dxa"/>
+            </w:tcMar>
+          </w:tcPr>
+          <w:p>
+            <w:pPr>
+              <w:spacing w:after="0" w:line="276" w:lineRule="auto"/>
+              <w:jc w:val="left"/>
+            </w:pPr>
+            <w:r>
+              <w:rPr>
+                <w:rFonts w:ascii="Consolas" w:hAnsi="Consolas" w:eastAsia="Consolas"/>
+                <w:color w:val="0B6F65"/>
+                <w:sz w:val="17"/>
+              </w:rPr>
+              <w:t>codex/v2-rebuild</w:t>
+            </w:r>
+            <w:r>
+              <w:rPr>
+                <w:rFonts w:ascii="Microsoft YaHei" w:hAnsi="Microsoft YaHei" w:eastAsia="Microsoft YaHei"/>
+                <w:color w:val="263B38"/>
+                <w:sz w:val="17"/>
+              </w:rPr>
+              <w:t xml:space="preserve"> 已推送，草稿 PR 待审核</w:t>
+            </w:r>
+          </w:p>
+        </w:tc>
+        <w:tc>
+          <w:tcPr>
+            <w:tcW w:type="dxa" w:w="2700"/>
+            <w:vAlign w:val="center"/>
+            <w:shd w:fill="FFFFFF"/>
+            <w:tcBorders>
+              <w:top w:val="single" w:sz="5" w:color="D9E2E0"/>
+              <w:left w:val="single" w:sz="5" w:color="D9E2E0"/>
+              <w:bottom w:val="single" w:sz="5" w:color="D9E2E0"/>
+              <w:right w:val="single" w:sz="5" w:color="D9E2E0"/>
+              <w:insideH w:val="single" w:sz="5" w:color="D9E2E0"/>
+              <w:insideV w:val="single" w:sz="5" w:color="D9E2E0"/>
+            </w:tcBorders>
+            <w:tcMar>
+              <w:top w:w="100" w:type="dxa"/>
+              <w:start w:w="120" w:type="dxa"/>
+              <w:bottom w:w="100" w:type="dxa"/>
+              <w:end w:w="120" w:type="dxa"/>
+            </w:tcMar>
+          </w:tcPr>
+          <w:p>
+            <w:pPr>
+              <w:spacing w:after="0" w:line="276" w:lineRule="auto"/>
+              <w:jc w:val="left"/>
+            </w:pPr>
+            <w:r>
+              <w:rPr>
+                <w:rFonts w:ascii="Microsoft YaHei" w:hAnsi="Microsoft YaHei" w:eastAsia="Microsoft YaHei"/>
+                <w:color w:val="263B38"/>
+                <w:sz w:val="17"/>
+              </w:rPr>
+              <w:t>[Pull Request #1](https://github.com/yingh2180-dotcom/consumer-signal-radar/pull/1)</w:t>
+            </w:r>
+          </w:p>
+        </w:tc>
+      </w:tr>
+      <w:tr>
+        <w:tc>
+          <w:tcPr>
+            <w:tcW w:type="dxa" w:w="1620"/>
+            <w:vAlign w:val="center"/>
+            <w:shd w:fill="F5F8F7"/>
+            <w:tcBorders>
+              <w:top w:val="single" w:sz="5" w:color="D9E2E0"/>
+              <w:left w:val="single" w:sz="5" w:color="D9E2E0"/>
+              <w:bottom w:val="single" w:sz="5" w:color="D9E2E0"/>
+              <w:right w:val="single" w:sz="5" w:color="D9E2E0"/>
+              <w:insideH w:val="single" w:sz="5" w:color="D9E2E0"/>
+              <w:insideV w:val="single" w:sz="5" w:color="D9E2E0"/>
+            </w:tcBorders>
+            <w:tcMar>
+              <w:top w:w="100" w:type="dxa"/>
+              <w:start w:w="120" w:type="dxa"/>
+              <w:bottom w:w="100" w:type="dxa"/>
+              <w:end w:w="120" w:type="dxa"/>
+            </w:tcMar>
+          </w:tcPr>
+          <w:p>
+            <w:pPr>
+              <w:spacing w:after="0" w:line="276" w:lineRule="auto"/>
+              <w:jc w:val="center"/>
+            </w:pPr>
+            <w:r>
+              <w:rPr>
+                <w:rFonts w:ascii="Microsoft YaHei" w:hAnsi="Microsoft YaHei" w:eastAsia="Microsoft YaHei"/>
+                <w:color w:val="263B38"/>
+                <w:sz w:val="17"/>
+              </w:rPr>
+              <w:t>飞书项目目录</w:t>
+            </w:r>
+          </w:p>
+        </w:tc>
+        <w:tc>
+          <w:tcPr>
+            <w:tcW w:type="dxa" w:w="4680"/>
+            <w:vAlign w:val="center"/>
+            <w:shd w:fill="F5F8F7"/>
+            <w:tcBorders>
+              <w:top w:val="single" w:sz="5" w:color="D9E2E0"/>
+              <w:left w:val="single" w:sz="5" w:color="D9E2E0"/>
+              <w:bottom w:val="single" w:sz="5" w:color="D9E2E0"/>
+              <w:right w:val="single" w:sz="5" w:color="D9E2E0"/>
+              <w:insideH w:val="single" w:sz="5" w:color="D9E2E0"/>
+              <w:insideV w:val="single" w:sz="5" w:color="D9E2E0"/>
+            </w:tcBorders>
+            <w:tcMar>
+              <w:top w:w="100" w:type="dxa"/>
+              <w:start w:w="120" w:type="dxa"/>
+              <w:bottom w:w="100" w:type="dxa"/>
+              <w:end w:w="120" w:type="dxa"/>
+            </w:tcMar>
+          </w:tcPr>
+          <w:p>
+            <w:pPr>
+              <w:spacing w:after="0" w:line="276" w:lineRule="auto"/>
+              <w:jc w:val="left"/>
+            </w:pPr>
+            <w:r>
+              <w:rPr>
+                <w:rFonts w:ascii="Microsoft YaHei" w:hAnsi="Microsoft YaHei" w:eastAsia="Microsoft YaHei"/>
+                <w:color w:val="263B38"/>
+                <w:sz w:val="17"/>
+              </w:rPr>
+              <w:t>已确认唯一目录“项目二消费者洞察”</w:t>
+            </w:r>
+          </w:p>
+        </w:tc>
+        <w:tc>
+          <w:tcPr>
+            <w:tcW w:type="dxa" w:w="2700"/>
+            <w:vAlign w:val="center"/>
+            <w:shd w:fill="F5F8F7"/>
+            <w:tcBorders>
+              <w:top w:val="single" w:sz="5" w:color="D9E2E0"/>
+              <w:left w:val="single" w:sz="5" w:color="D9E2E0"/>
+              <w:bottom w:val="single" w:sz="5" w:color="D9E2E0"/>
+              <w:right w:val="single" w:sz="5" w:color="D9E2E0"/>
+              <w:insideH w:val="single" w:sz="5" w:color="D9E2E0"/>
+              <w:insideV w:val="single" w:sz="5" w:color="D9E2E0"/>
+            </w:tcBorders>
+            <w:tcMar>
+              <w:top w:w="100" w:type="dxa"/>
+              <w:start w:w="120" w:type="dxa"/>
+              <w:bottom w:w="100" w:type="dxa"/>
+              <w:end w:w="120" w:type="dxa"/>
+            </w:tcMar>
+          </w:tcPr>
+          <w:p>
+            <w:pPr>
+              <w:spacing w:after="0" w:line="276" w:lineRule="auto"/>
+              <w:jc w:val="left"/>
+            </w:pPr>
+            <w:r>
+              <w:rPr>
+                <w:rFonts w:ascii="Microsoft YaHei" w:hAnsi="Microsoft YaHei" w:eastAsia="Microsoft YaHei"/>
+                <w:color w:val="263B38"/>
+                <w:sz w:val="17"/>
+              </w:rPr>
+              <w:t>[项目二消费者洞察](https://my.feishu.cn/drive/folder/GdsxfK8ryl257Wd9DlmcVvWtneg)</w:t>
+            </w:r>
+          </w:p>
+        </w:tc>
+      </w:tr>
+      <w:tr>
+        <w:tc>
+          <w:tcPr>
+            <w:tcW w:type="dxa" w:w="1620"/>
+            <w:vAlign w:val="center"/>
+            <w:shd w:fill="FFFFFF"/>
+            <w:tcBorders>
+              <w:top w:val="single" w:sz="5" w:color="D9E2E0"/>
+              <w:left w:val="single" w:sz="5" w:color="D9E2E0"/>
+              <w:bottom w:val="single" w:sz="5" w:color="D9E2E0"/>
+              <w:right w:val="single" w:sz="5" w:color="D9E2E0"/>
+              <w:insideH w:val="single" w:sz="5" w:color="D9E2E0"/>
+              <w:insideV w:val="single" w:sz="5" w:color="D9E2E0"/>
+            </w:tcBorders>
+            <w:tcMar>
+              <w:top w:w="100" w:type="dxa"/>
+              <w:start w:w="120" w:type="dxa"/>
+              <w:bottom w:w="100" w:type="dxa"/>
+              <w:end w:w="120" w:type="dxa"/>
+            </w:tcMar>
+          </w:tcPr>
+          <w:p>
+            <w:pPr>
+              <w:spacing w:after="0" w:line="276" w:lineRule="auto"/>
+              <w:jc w:val="center"/>
+            </w:pPr>
+            <w:r>
+              <w:rPr>
+                <w:rFonts w:ascii="Microsoft YaHei" w:hAnsi="Microsoft YaHei" w:eastAsia="Microsoft YaHei"/>
+                <w:color w:val="263B38"/>
+                <w:sz w:val="17"/>
+              </w:rPr>
+              <w:t>飞书聊天归档</w:t>
+            </w:r>
+          </w:p>
+        </w:tc>
+        <w:tc>
+          <w:tcPr>
+            <w:tcW w:type="dxa" w:w="4680"/>
+            <w:vAlign w:val="center"/>
+            <w:shd w:fill="FFFFFF"/>
+            <w:tcBorders>
+              <w:top w:val="single" w:sz="5" w:color="D9E2E0"/>
+              <w:left w:val="single" w:sz="5" w:color="D9E2E0"/>
+              <w:bottom w:val="single" w:sz="5" w:color="D9E2E0"/>
+              <w:right w:val="single" w:sz="5" w:color="D9E2E0"/>
+              <w:insideH w:val="single" w:sz="5" w:color="D9E2E0"/>
+              <w:insideV w:val="single" w:sz="5" w:color="D9E2E0"/>
+            </w:tcBorders>
+            <w:tcMar>
+              <w:top w:w="100" w:type="dxa"/>
+              <w:start w:w="120" w:type="dxa"/>
+              <w:bottom w:w="100" w:type="dxa"/>
+              <w:end w:w="120" w:type="dxa"/>
+            </w:tcMar>
+          </w:tcPr>
+          <w:p>
+            <w:pPr>
+              <w:spacing w:after="0" w:line="276" w:lineRule="auto"/>
+              <w:jc w:val="left"/>
+            </w:pPr>
+            <w:r>
+              <w:rPr>
+                <w:rFonts w:ascii="Microsoft YaHei" w:hAnsi="Microsoft YaHei" w:eastAsia="Microsoft YaHei"/>
+                <w:color w:val="263B38"/>
+                <w:sz w:val="17"/>
+              </w:rPr>
+              <w:t>已按开始日期、Agent 和聊天名称归档</w:t>
+            </w:r>
+          </w:p>
+        </w:tc>
+        <w:tc>
+          <w:tcPr>
+            <w:tcW w:type="dxa" w:w="2700"/>
+            <w:vAlign w:val="center"/>
+            <w:shd w:fill="FFFFFF"/>
+            <w:tcBorders>
+              <w:top w:val="single" w:sz="5" w:color="D9E2E0"/>
+              <w:left w:val="single" w:sz="5" w:color="D9E2E0"/>
+              <w:bottom w:val="single" w:sz="5" w:color="D9E2E0"/>
+              <w:right w:val="single" w:sz="5" w:color="D9E2E0"/>
+              <w:insideH w:val="single" w:sz="5" w:color="D9E2E0"/>
+              <w:insideV w:val="single" w:sz="5" w:color="D9E2E0"/>
+            </w:tcBorders>
+            <w:tcMar>
+              <w:top w:w="100" w:type="dxa"/>
+              <w:start w:w="120" w:type="dxa"/>
+              <w:bottom w:w="100" w:type="dxa"/>
+              <w:end w:w="120" w:type="dxa"/>
+            </w:tcMar>
+          </w:tcPr>
+          <w:p>
+            <w:pPr>
+              <w:spacing w:after="0" w:line="276" w:lineRule="auto"/>
+              <w:jc w:val="left"/>
+            </w:pPr>
+            <w:r>
+              <w:rPr>
+                <w:rFonts w:ascii="Microsoft YaHei" w:hAnsi="Microsoft YaHei" w:eastAsia="Microsoft YaHei"/>
+                <w:color w:val="263B38"/>
+                <w:sz w:val="17"/>
+              </w:rPr>
+              <w:t>[2026-09-15-Codex-消费者洞察五层Demo](https://my.feishu.cn/docx/Fl2CdGSjUoS2JcxeXrncX21qnPb)</w:t>
+            </w:r>
+          </w:p>
+        </w:tc>
+      </w:tr>
+      <w:tr>
+        <w:tc>
+          <w:tcPr>
+            <w:tcW w:type="dxa" w:w="1620"/>
+            <w:vAlign w:val="center"/>
+            <w:shd w:fill="F5F8F7"/>
+            <w:tcBorders>
+              <w:top w:val="single" w:sz="5" w:color="D9E2E0"/>
+              <w:left w:val="single" w:sz="5" w:color="D9E2E0"/>
+              <w:bottom w:val="single" w:sz="5" w:color="D9E2E0"/>
+              <w:right w:val="single" w:sz="5" w:color="D9E2E0"/>
+              <w:insideH w:val="single" w:sz="5" w:color="D9E2E0"/>
+              <w:insideV w:val="single" w:sz="5" w:color="D9E2E0"/>
+            </w:tcBorders>
+            <w:tcMar>
+              <w:top w:w="100" w:type="dxa"/>
+              <w:start w:w="120" w:type="dxa"/>
+              <w:bottom w:w="100" w:type="dxa"/>
+              <w:end w:w="120" w:type="dxa"/>
+            </w:tcMar>
+          </w:tcPr>
+          <w:p>
+            <w:pPr>
+              <w:spacing w:after="0" w:line="276" w:lineRule="auto"/>
+              <w:jc w:val="center"/>
+            </w:pPr>
+            <w:r>
+              <w:rPr>
+                <w:rFonts w:ascii="Microsoft YaHei" w:hAnsi="Microsoft YaHei" w:eastAsia="Microsoft YaHei"/>
+                <w:color w:val="263B38"/>
+                <w:sz w:val="17"/>
+              </w:rPr>
+              <w:t>飞书引用文档</w:t>
+            </w:r>
+          </w:p>
+        </w:tc>
+        <w:tc>
+          <w:tcPr>
+            <w:tcW w:type="dxa" w:w="4680"/>
+            <w:vAlign w:val="center"/>
+            <w:shd w:fill="F5F8F7"/>
+            <w:tcBorders>
+              <w:top w:val="single" w:sz="5" w:color="D9E2E0"/>
+              <w:left w:val="single" w:sz="5" w:color="D9E2E0"/>
+              <w:bottom w:val="single" w:sz="5" w:color="D9E2E0"/>
+              <w:right w:val="single" w:sz="5" w:color="D9E2E0"/>
+              <w:insideH w:val="single" w:sz="5" w:color="D9E2E0"/>
+              <w:insideV w:val="single" w:sz="5" w:color="D9E2E0"/>
+            </w:tcBorders>
+            <w:tcMar>
+              <w:top w:w="100" w:type="dxa"/>
+              <w:start w:w="120" w:type="dxa"/>
+              <w:bottom w:w="100" w:type="dxa"/>
+              <w:end w:w="120" w:type="dxa"/>
+            </w:tcMar>
+          </w:tcPr>
+          <w:p>
+            <w:pPr>
+              <w:spacing w:after="0" w:line="276" w:lineRule="auto"/>
+              <w:jc w:val="left"/>
+            </w:pPr>
+            <w:r>
+              <w:rPr>
+                <w:rFonts w:ascii="Microsoft YaHei" w:hAnsi="Microsoft YaHei" w:eastAsia="Microsoft YaHei"/>
+                <w:color w:val="263B38"/>
+                <w:sz w:val="17"/>
+              </w:rPr>
+              <w:t>已创建标准附件目录，本计划作为在线文档存放</w:t>
+            </w:r>
+          </w:p>
+        </w:tc>
+        <w:tc>
+          <w:tcPr>
+            <w:tcW w:type="dxa" w:w="2700"/>
+            <w:vAlign w:val="center"/>
+            <w:shd w:fill="F5F8F7"/>
+            <w:tcBorders>
+              <w:top w:val="single" w:sz="5" w:color="D9E2E0"/>
+              <w:left w:val="single" w:sz="5" w:color="D9E2E0"/>
+              <w:bottom w:val="single" w:sz="5" w:color="D9E2E0"/>
+              <w:right w:val="single" w:sz="5" w:color="D9E2E0"/>
+              <w:insideH w:val="single" w:sz="5" w:color="D9E2E0"/>
+              <w:insideV w:val="single" w:sz="5" w:color="D9E2E0"/>
+            </w:tcBorders>
+            <w:tcMar>
+              <w:top w:w="100" w:type="dxa"/>
+              <w:start w:w="120" w:type="dxa"/>
+              <w:bottom w:w="100" w:type="dxa"/>
+              <w:end w:w="120" w:type="dxa"/>
+            </w:tcMar>
+          </w:tcPr>
+          <w:p>
+            <w:pPr>
+              <w:spacing w:after="0" w:line="276" w:lineRule="auto"/>
+              <w:jc w:val="left"/>
+            </w:pPr>
+            <w:r>
+              <w:rPr>
+                <w:rFonts w:ascii="Microsoft YaHei" w:hAnsi="Microsoft YaHei" w:eastAsia="Microsoft YaHei"/>
+                <w:color w:val="263B38"/>
+                <w:sz w:val="17"/>
+              </w:rPr>
+              <w:t>[引用文档与附件](https://my.feishu.cn/drive/folder/TLKKfHca2l9UgFdHT8Lc6noqnOh)</w:t>
+            </w:r>
+          </w:p>
+        </w:tc>
+      </w:tr>
+    </w:tbl>
+    <w:p>
+      <w:pPr>
+        <w:spacing w:after="40"/>
+      </w:pPr>
     </w:p>
     <w:p>
       <w:r>

</xml_diff>

<commit_message>
fix: align 2.0 release structure and chat archive layout
</commit_message>
<xml_diff>
--- a/docs/20_Demo_2.0当前完成情况与后续执行计划.docx
+++ b/docs/20_Demo_2.0当前完成情况与后续执行计划.docx
@@ -238,7 +238,7 @@
           <w:color w:val="263B38"/>
           <w:sz w:val="21"/>
         </w:rPr>
-        <w:t>GitHub 与飞书协作基础设施已经落地。</w:t>
+        <w:t xml:space="preserve">GitHub 与飞书协作基础设施已经落地。GitHub </w:t>
       </w:r>
       <w:r>
         <w:rPr>
@@ -254,7 +254,7 @@
           <w:color w:val="263B38"/>
           <w:sz w:val="21"/>
         </w:rPr>
-        <w:t>、</w:t>
+        <w:t xml:space="preserve"> 是当前正式 2.0 主线；</w:t>
       </w:r>
       <w:r>
         <w:rPr>
@@ -270,7 +270,7 @@
           <w:color w:val="263B38"/>
           <w:sz w:val="21"/>
         </w:rPr>
-        <w:t>、</w:t>
+        <w:t xml:space="preserve"> 只维护 1.0 的紧急问题；</w:t>
       </w:r>
       <w:r>
         <w:rPr>
@@ -286,7 +286,7 @@
           <w:color w:val="263B38"/>
           <w:sz w:val="21"/>
         </w:rPr>
-        <w:t xml:space="preserve"> 和 </w:t>
+        <w:t xml:space="preserve"> 保留 2.0 重构和审核过程。</w:t>
       </w:r>
       <w:r>
         <w:rPr>
@@ -302,7 +302,23 @@
           <w:color w:val="263B38"/>
           <w:sz w:val="21"/>
         </w:rPr>
-        <w:t xml:space="preserve"> 均已推送到远端；2.0 已建立[草稿合并请求 #1](https://github.com/yingh2180-dotcom/consumer-signal-radar/pull/1)，尚未合并，因此 1.0 仍是当前正式主线。飞书已建立固定项目目录、聊天归档和“引用文档与附件”目录，后续项目讨论文档统一放入该位置。</w:t>
+        <w:t xml:space="preserve"> 与 </w:t>
+      </w:r>
+      <w:r>
+        <w:rPr>
+          <w:rFonts w:ascii="Consolas" w:hAnsi="Consolas" w:eastAsia="Consolas"/>
+          <w:color w:val="0B6F65"/>
+          <w:sz w:val="19"/>
+        </w:rPr>
+        <w:t>v2.0.0</w:t>
+      </w:r>
+      <w:r>
+        <w:rPr>
+          <w:rFonts w:ascii="Microsoft YaHei" w:hAnsi="Microsoft YaHei" w:eastAsia="Microsoft YaHei"/>
+          <w:color w:val="263B38"/>
+          <w:sz w:val="21"/>
+        </w:rPr>
+        <w:t xml:space="preserve"> 固定两个正式版本，并分别建立 GitHub Release。飞书已建立固定项目目录、聊天归档和“引用文档与附件”目录，后续项目讨论文档统一放入该位置。</w:t>
       </w:r>
     </w:p>
     <w:p>
@@ -503,11 +519,19 @@
             </w:pPr>
             <w:r>
               <w:rPr>
+                <w:rFonts w:ascii="Microsoft YaHei" w:hAnsi="Microsoft YaHei" w:eastAsia="Microsoft YaHei"/>
+                <w:color w:val="263B38"/>
+                <w:sz w:val="17"/>
+              </w:rPr>
+              <w:t>PR #1 自动检查通过并已合并，</w:t>
+            </w:r>
+            <w:r>
+              <w:rPr>
                 <w:rFonts w:ascii="Consolas" w:hAnsi="Consolas" w:eastAsia="Consolas"/>
                 <w:color w:val="0B6F65"/>
                 <w:sz w:val="17"/>
               </w:rPr>
-              <w:t>codex/v2-rebuild</w:t>
+              <w:t>main</w:t>
             </w:r>
             <w:r>
               <w:rPr>
@@ -515,7 +539,7 @@
                 <w:color w:val="263B38"/>
                 <w:sz w:val="17"/>
               </w:rPr>
-              <w:t xml:space="preserve"> 已推送，草稿 PR 待审核</w:t>
+              <w:t xml:space="preserve"> 为当前正式 2.0</w:t>
             </w:r>
           </w:p>
         </w:tc>
@@ -5685,7 +5709,7 @@
           <w:color w:val="263B38"/>
           <w:sz w:val="21"/>
         </w:rPr>
-        <w:t xml:space="preserve">（合并前为 </w:t>
+        <w:t xml:space="preserve"> 的仓库根目录视为 2.0 的唯一正式代码目录。</w:t>
       </w:r>
       <w:r>
         <w:rPr>
@@ -5701,7 +5725,7 @@
           <w:color w:val="263B38"/>
           <w:sz w:val="21"/>
         </w:rPr>
-        <w:t xml:space="preserve">）的仓库根目录视为 2.0 的唯一正式代码目录。1.0 只能通过 </w:t>
+        <w:t xml:space="preserve"> 只用于追溯本次重构审核过程；1.0 只能通过 </w:t>
       </w:r>
       <w:r>
         <w:rPr>

</xml_diff>